<commit_message>
Agrega teléfono del administrador a la plantilla de carta sin adeudo
La carta de "no adeudo" no incluía el Celular debajo de "Administrador
Profesional." como sí lo hace la de adeudo. Se agrega usando el mismo
número de ejemplo que el resto de plantillas por defecto, para que el
reemplazo dinámico por el teléfono configurado del condominio siga
funcionando igual que en la carta de adeudo.

Co-Authored-By: Claude Sonnet 5 <noreply@anthropic.com>
</commit_message>
<xml_diff>
--- a/resources/docx/billing/carta-no-adeudo.docx
+++ b/resources/docx/billing/carta-no-adeudo.docx
@@ -518,6 +518,19 @@
           <w:szCs w:val="24"/>
         </w:rPr>
         <w:t>.</w:t>
+      </w:r>
+    </w:p>
+    <w:p>
+      <w:pPr>
+        <w:jc w:val="both"/>
+      </w:pPr>
+      <w:r>
+        <w:rPr>
+          <w:rFonts w:ascii="Arial" w:hAnsi="Arial" w:cs="Arial"/>
+          <w:sz w:val="24"/>
+          <w:szCs w:val="24"/>
+        </w:rPr>
+        <w:t xml:space="preserve">Celular: 55 3070 7950</w:t>
       </w:r>
     </w:p>
     <w:p>

</xml_diff>